<commit_message>
docs: incorporar requisitos de catedra — hiperparametros, SHAP obligatorio, reproducibilidad de entrega
</commit_message>
<xml_diff>
--- a/reports/DS2_Pipeline_Analitico_Proyecto_Final.docx
+++ b/reports/DS2_Pipeline_Analitico_Proyecto_Final.docx
@@ -1945,13 +1945,6 @@
                 <w:szCs w:val="20"/>
               </w:rPr>
               <w:t xml:space="preserve">Es una medida acumulativa y estructural. Puede introducir </w:t>
-            </w:r>
-            <w:r>
-              <w:rPr>
-                <w:color w:val="000000"/>
-                <w:sz w:val="20"/>
-                <w:szCs w:val="20"/>
-              </w:rPr>
               <w:lastRenderedPageBreak/>
               <w:t>problemas de interpretación dinámica en el modelo base. Se usa para análisis de riesgo y storytelling.</w:t>
             </w:r>
@@ -8813,7 +8806,120 @@
         <w:pStyle w:val="Ttulo2"/>
       </w:pPr>
       <w:r>
-        <w:t>8.6 Bloque 4 — Validación Temporal</w:t>
+        <w:t>8.6 Bloque 4 — Optimización de Hiperparámetros</w:t>
+      </w:r>
+    </w:p>
+    <w:p>
+      <w:pPr>
+        <w:spacing w:after="60" w:before="60"/>
+      </w:pPr>
+      <w:r>
+        <w:rPr>
+          <w:rFonts w:ascii="Arial" w:cs="Arial" w:eastAsia="Arial" w:hAnsi="Arial"/>
+          <w:sz w:val="22"/>
+          <w:szCs w:val="22"/>
+          <w:color w:val="222222"/>
+        </w:rPr>
+        <w:t xml:space="preserve">Exigencia de la cátedra (Unidad de Entrega Final). Antes de comparar el desempeño final de los modelos, se realiza una búsqueda de hiperparámetros para evitar que la comparación entre modelos esté sesgada por configuraciones por defecto no representativas.</w:t>
+      </w:r>
+    </w:p>
+    <w:p>
+      <w:pPr>
+        <w:spacing w:after="40" w:before="60"/>
+      </w:pPr>
+      <w:r>
+        <w:rPr>
+          <w:rFonts w:ascii="Arial" w:cs="Arial" w:eastAsia="Arial" w:hAnsi="Arial"/>
+          <w:b/>
+          <w:sz w:val="22"/>
+          <w:szCs w:val="22"/>
+          <w:color w:val="222222"/>
+        </w:rPr>
+        <w:t xml:space="preserve">Estrategia:</w:t>
+      </w:r>
+    </w:p>
+    <w:p>
+      <w:pPr>
+        <w:numPr>
+          <w:ilvl w:val="0"/>
+          <w:numId w:val="1"/>
+        </w:numPr>
+        <w:spacing w:after="40" w:before="40"/>
+      </w:pPr>
+      <w:r>
+        <w:rPr>
+          <w:rFonts w:ascii="Arial" w:cs="Arial" w:eastAsia="Arial" w:hAnsi="Arial"/>
+          <w:sz w:val="22"/>
+          <w:szCs w:val="22"/>
+          <w:color w:val="222222"/>
+        </w:rPr>
+        <w:t xml:space="preserve">RandomizedSearchCV con un número acotado de iteraciones, dado el volumen moderado de observaciones (~1096 días) y para evitar sobreajuste de hiperparámetros sobre una serie temporal ya de por sí ruidosa.</w:t>
+      </w:r>
+    </w:p>
+    <w:p>
+      <w:pPr>
+        <w:numPr>
+          <w:ilvl w:val="0"/>
+          <w:numId w:val="1"/>
+        </w:numPr>
+        <w:spacing w:after="40" w:before="40"/>
+      </w:pPr>
+      <w:r>
+        <w:rPr>
+          <w:rFonts w:ascii="Arial" w:cs="Arial" w:eastAsia="Arial" w:hAnsi="Arial"/>
+          <w:sz w:val="22"/>
+          <w:szCs w:val="22"/>
+          <w:color w:val="222222"/>
+        </w:rPr>
+        <w:t xml:space="preserve">Validación cruzada interna mediante TimeSeriesSplit (no KFold tradicional), para no romper la estructura temporal durante la búsqueda.</w:t>
+      </w:r>
+    </w:p>
+    <w:p>
+      <w:pPr>
+        <w:numPr>
+          <w:ilvl w:val="0"/>
+          <w:numId w:val="1"/>
+        </w:numPr>
+        <w:spacing w:after="40" w:before="40"/>
+      </w:pPr>
+      <w:r>
+        <w:rPr>
+          <w:rFonts w:ascii="Arial" w:cs="Arial" w:eastAsia="Arial" w:hAnsi="Arial"/>
+          <w:sz w:val="22"/>
+          <w:szCs w:val="22"/>
+          <w:color w:val="222222"/>
+        </w:rPr>
+        <w:t xml:space="preserve">Se prioriza Random Forest y XGBoost para la búsqueda, ya que los modelos lineales (LR, Ridge, Lasso) tienen un espacio de hiperparámetros mucho más reducido y de menor impacto relativo.</w:t>
+      </w:r>
+    </w:p>
+    <w:p>
+      <w:pPr>
+        <w:spacing w:after="60" w:before="80"/>
+      </w:pPr>
+      <w:r>
+        <w:rPr>
+          <w:rFonts w:ascii="Arial" w:cs="Arial" w:eastAsia="Arial" w:hAnsi="Arial"/>
+          <w:sz w:val="22"/>
+          <w:szCs w:val="22"/>
+          <w:color w:val="222222"/>
+        </w:rPr>
+        <w:t xml:space="preserve">El objetivo no es maximizar agresivamente el desempeño, sino asegurar que la comparación de modelos del Bloque 3 sea justa: cada modelo es evaluado en su configuración razonablemente óptima, no en su configuración por defecto.</w:t>
+      </w:r>
+    </w:p>
+    <w:p>
+      <w:pPr>
+        <w:spacing w:after="80" w:before="80"/>
+      </w:pPr>
+      <w:r>
+        <w:t xml:space="preserve"/>
+      </w:r>
+    </w:p>
+    <w:p>
+      <w:pPr>
+        <w:pStyle w:val="Ttulo2"/>
+      </w:pPr>
+      <w:r>
+        <w:t>8.7 Bloque 5 — Validación Temporal</w:t>
       </w:r>
     </w:p>
     <w:p>
@@ -9133,7 +9239,7 @@
       </w:pPr>
       <w:r>
         <w:lastRenderedPageBreak/>
-        <w:t>8.7 Bloque 5 — Feature Importance</w:t>
+        <w:t>8.8 Bloque 6 — Feature Importance</w:t>
       </w:r>
     </w:p>
     <w:p>
@@ -9159,7 +9265,7 @@
         <w:spacing w:before="40" w:after="40"/>
       </w:pPr>
       <w:r>
-        <w:t>Técnica opcional: SHAP (SHapley Additive exPlanations) para interpretabilidad avanzada.</w:t>
+        <w:t>Técnica obligatoria: SHAP (SHapley Additive exPlanations) para interpretabilidad a nivel de predicción individual. Exigencia de la cátedra (Unidad de Entrega Final).</w:t>
       </w:r>
     </w:p>
     <w:p>
@@ -9185,7 +9291,7 @@
         <w:pStyle w:val="Ttulo2"/>
       </w:pPr>
       <w:r>
-        <w:t>8.8 Bloque 6 — Análisis de Robustez</w:t>
+        <w:t>8.9 Bloque 7 — Análisis de Robustez</w:t>
       </w:r>
     </w:p>
     <w:p>
@@ -9237,7 +9343,7 @@
         <w:pStyle w:val="Ttulo2"/>
       </w:pPr>
       <w:r>
-        <w:t>8.9 Bloque 7 — Cierre: Resultados vs. Hipótesis</w:t>
+        <w:t>8.10 Bloque 8 — Cierre: Resultados vs. Hipótesis</w:t>
       </w:r>
     </w:p>
     <w:p>
@@ -9605,6 +9711,116 @@
       <w:pPr>
         <w:spacing w:before="80" w:after="80"/>
       </w:pPr>
+    </w:p>
+    <w:p>
+      <w:pPr>
+        <w:pStyle w:val="Ttulo1"/>
+      </w:pPr>
+      <w:r>
+        <w:t>9. Entrega y Reproducibilidad</w:t>
+      </w:r>
+    </w:p>
+    <w:p>
+      <w:pPr>
+        <w:spacing w:after="60" w:before="60"/>
+      </w:pPr>
+      <w:r>
+        <w:rPr>
+          <w:rFonts w:ascii="Arial" w:cs="Arial" w:eastAsia="Arial" w:hAnsi="Arial"/>
+          <w:sz w:val="22"/>
+          <w:szCs w:val="22"/>
+          <w:color w:val="222222"/>
+        </w:rPr>
+        <w:t xml:space="preserve">Esta sección documenta los requisitos de entrega exigidos por la cátedra (Unidad de Entrega Final) y cómo el proyecto los satisface.</w:t>
+      </w:r>
+    </w:p>
+    <w:p>
+      <w:pPr>
+        <w:pStyle w:val="Ttulo2"/>
+      </w:pPr>
+      <w:r>
+        <w:t>9.1 Repositorio público</w:t>
+      </w:r>
+    </w:p>
+    <w:p>
+      <w:pPr>
+        <w:spacing w:after="60" w:before="60"/>
+      </w:pPr>
+      <w:r>
+        <w:rPr>
+          <w:rFonts w:ascii="Arial" w:cs="Arial" w:eastAsia="Arial" w:hAnsi="Arial"/>
+          <w:sz w:val="22"/>
+          <w:szCs w:val="22"/>
+          <w:color w:val="222222"/>
+        </w:rPr>
+        <w:t xml:space="preserve">El repositorio se mantiene privado durante el desarrollo del proyecto. Antes de la fecha de entrega, se cambia su visibilidad a pública, condición exigida por la cátedra para que el proyecto pueda ser evaluado.</w:t>
+      </w:r>
+    </w:p>
+    <w:p>
+      <w:pPr>
+        <w:pStyle w:val="Ttulo2"/>
+      </w:pPr>
+      <w:r>
+        <w:t>9.2 Reproducibilidad del dataset</w:t>
+      </w:r>
+    </w:p>
+    <w:p>
+      <w:pPr>
+        <w:spacing w:after="60" w:before="60"/>
+      </w:pPr>
+      <w:r>
+        <w:rPr>
+          <w:rFonts w:ascii="Arial" w:cs="Arial" w:eastAsia="Arial" w:hAnsi="Arial"/>
+          <w:sz w:val="22"/>
+          <w:szCs w:val="22"/>
+          <w:color w:val="222222"/>
+        </w:rPr>
+        <w:t xml:space="preserve">Los datos crudos e intermedios (`data/raw/`, `data/interim/`) permanecen excluidos del repositorio. Sin embargo, el dataset final de modelado (`dataset_modeling.csv`) y el dataset de features completo (`dataset_features_full.csv`) se incluyen como artefactos de entrega, dado que el pipeline completo (notebooks 01 a 06) requiere una ejecución secuencial considerable y depende de la disponibilidad de APIs externas en el momento de la corrección.</w:t>
+      </w:r>
+    </w:p>
+    <w:p>
+      <w:pPr>
+        <w:spacing w:after="60" w:before="60"/>
+      </w:pPr>
+      <w:r>
+        <w:rPr>
+          <w:rFonts w:ascii="Arial" w:cs="Arial" w:eastAsia="Arial" w:hAnsi="Arial"/>
+          <w:sz w:val="22"/>
+          <w:szCs w:val="22"/>
+          <w:color w:val="222222"/>
+        </w:rPr>
+        <w:t xml:space="preserve">Esto permite dos caminos de reproducción equivalentes: (a) ejecutar el pipeline completo desde el notebook 01, regenerando todos los datos desde las fuentes originales; o (b) partir directamente de los datasets incluidos y ejecutar únicamente los notebooks de modelado (08 y 09).</w:t>
+      </w:r>
+    </w:p>
+    <w:p>
+      <w:pPr>
+        <w:pStyle w:val="Ttulo2"/>
+      </w:pPr>
+      <w:r>
+        <w:t>9.3 Documentación de reproducción</w:t>
+      </w:r>
+    </w:p>
+    <w:p>
+      <w:pPr>
+        <w:spacing w:after="60" w:before="60"/>
+      </w:pPr>
+      <w:r>
+        <w:rPr>
+          <w:rFonts w:ascii="Arial" w:cs="Arial" w:eastAsia="Arial" w:hAnsi="Arial"/>
+          <w:sz w:val="22"/>
+          <w:szCs w:val="22"/>
+          <w:color w:val="222222"/>
+        </w:rPr>
+        <w:t xml:space="preserve">El README incluye una sección de instrucciones paso a paso para reproducir el proyecto, dirigida a un evaluador externo sin contexto previo. La GUIA_ESTRUCTURADA.md complementa esa información con el detalle técnico completo de cada notebook, las convenciones del proyecto y las decisiones de diseño documentadas.</w:t>
+      </w:r>
+    </w:p>
+    <w:p>
+      <w:pPr>
+        <w:spacing w:after="80" w:before="80"/>
+      </w:pPr>
+      <w:r>
+        <w:t xml:space="preserve"/>
+      </w:r>
     </w:p>
     <w:p>
       <w:pPr>

</xml_diff>